<commit_message>
LEEME: cómo clonar el repositorio
</commit_message>
<xml_diff>
--- a/LEEME.docx
+++ b/LEEME.docx
@@ -1307,6 +1307,101 @@
           <w:color w:val="333333"/>
         </w:rPr>
         <w:t xml:space="preserve">En ningún momento del curso se conecta ningún dato ni ningún sistema real de la empresa.</w:t>
+      </w:r>
+    </w:p>
+    <w:p>
+      <w:pPr>
+        <w:pBdr>
+          <w:bottom w:val="single" w:color="DDDDDD" w:sz="6" w:space="6"/>
+        </w:pBdr>
+        <w:spacing w:after="160" w:before="160"/>
+      </w:pPr>
+    </w:p>
+    <w:p>
+      <w:pPr>
+        <w:pStyle w:val="Heading2"/>
+        <w:spacing w:after="140" w:before="280"/>
+      </w:pPr>
+      <w:r>
+        <w:rPr>
+          <w:rFonts w:ascii="Arial" w:cs="Arial" w:eastAsia="Arial" w:hAnsi="Arial"/>
+          <w:b/>
+          <w:bCs/>
+          <w:color w:val="020857"/>
+          <w:sz w:val="26"/>
+          <w:szCs w:val="26"/>
+        </w:rPr>
+        <w:t xml:space="preserve">Cómo conseguir esta carpeta</w:t>
+      </w:r>
+    </w:p>
+    <w:p>
+      <w:pPr>
+        <w:spacing w:after="140" w:line="300"/>
+      </w:pPr>
+      <w:r>
+        <w:rPr>
+          <w:rFonts w:ascii="Arial" w:cs="Arial" w:eastAsia="Arial" w:hAnsi="Arial"/>
+          <w:color w:val="333333"/>
+        </w:rPr>
+        <w:t xml:space="preserve">Se clona desde GitHub, no se descarga a mano:</w:t>
+      </w:r>
+    </w:p>
+    <w:p>
+      <w:pPr>
+        <w:pBdr>
+          <w:left w:val="single" w:color="35B3C6" w:sz="18" w:space="8"/>
+        </w:pBdr>
+        <w:shd w:fill="EFEFEF" w:val="clear"/>
+        <w:spacing w:after="160" w:before="120"/>
+      </w:pPr>
+      <w:r>
+        <w:rPr>
+          <w:rFonts w:ascii="Courier New" w:cs="Courier New" w:eastAsia="Courier New" w:hAnsi="Courier New"/>
+          <w:color w:val="333333"/>
+          <w:sz w:val="18"/>
+          <w:szCs w:val="18"/>
+        </w:rPr>
+        <w:t xml:space="preserve">https://github.com/stefrin21/wk-academy-caso.git</w:t>
+      </w:r>
+    </w:p>
+    <w:p>
+      <w:pPr>
+        <w:spacing w:after="140" w:line="300"/>
+      </w:pPr>
+      <w:r>
+        <w:rPr>
+          <w:rFonts w:ascii="Arial" w:cs="Arial" w:eastAsia="Arial" w:hAnsi="Arial"/>
+          <w:color w:val="333333"/>
+        </w:rPr>
+        <w:t xml:space="preserve">En VS Code: </w:t>
+      </w:r>
+      <w:r>
+        <w:rPr>
+          <w:rFonts w:ascii="Courier New" w:cs="Courier New" w:eastAsia="Courier New" w:hAnsi="Courier New"/>
+          <w:color w:val="333333"/>
+        </w:rPr>
+        <w:t xml:space="preserve">Cmd/Ctrl + Shift + P</w:t>
+      </w:r>
+      <w:r>
+        <w:rPr>
+          <w:rFonts w:ascii="Arial" w:cs="Arial" w:eastAsia="Arial" w:hAnsi="Arial"/>
+          <w:color w:val="333333"/>
+        </w:rPr>
+        <w:t xml:space="preserve"> → </w:t>
+      </w:r>
+      <w:r>
+        <w:rPr>
+          <w:rFonts w:ascii="Courier New" w:cs="Courier New" w:eastAsia="Courier New" w:hAnsi="Courier New"/>
+          <w:color w:val="333333"/>
+        </w:rPr>
+        <w:t xml:space="preserve">Git: Clone</w:t>
+      </w:r>
+      <w:r>
+        <w:rPr>
+          <w:rFonts w:ascii="Arial" w:cs="Arial" w:eastAsia="Arial" w:hAnsi="Arial"/>
+          <w:color w:val="333333"/>
+        </w:rPr>
+        <w:t xml:space="preserve"> → pegar esa dirección → elegir dónde guardarla. Al abrirse, VS Code pregunta si confía en la carpeta: hay que decir que sí.</w:t>
       </w:r>
     </w:p>
     <w:p>

</xml_diff>

<commit_message>
Módulo 3: los cinco prompts de montaje y el modelo de .env
Co-Authored-By: Claude Opus 5.5 <noreply@anthropic.com>
</commit_message>
<xml_diff>
--- a/LEEME.docx
+++ b/LEEME.docx
@@ -1308,6 +1308,175 @@
                 <w:color w:val="333333"/>
               </w:rPr>
               <w:t xml:space="preserve">Módulo 3 · ruta PO</w:t>
+            </w:r>
+          </w:p>
+        </w:tc>
+      </w:tr>
+      <w:tr>
+        <w:tc>
+          <w:tcPr>
+            <w:tcW w:type="dxa" w:w="1987"/>
+            <w:shd w:fill="FFFFFF" w:val="clear"/>
+            <w:tcMar>
+              <w:top w:type="dxa" w:w="60"/>
+              <w:left w:type="dxa" w:w="120"/>
+              <w:bottom w:type="dxa" w:w="60"/>
+              <w:right w:type="dxa" w:w="120"/>
+            </w:tcMar>
+          </w:tcPr>
+          <w:p>
+            <w:pPr>
+              <w:spacing w:after="60" w:before="60"/>
+            </w:pPr>
+            <w:r>
+              <w:rPr>
+                <w:rFonts w:ascii="Courier New" w:cs="Courier New" w:eastAsia="Courier New" w:hAnsi="Courier New"/>
+                <w:color w:val="333333"/>
+              </w:rPr>
+              <w:t xml:space="preserve">prompts/</w:t>
+            </w:r>
+            <w:r>
+              <w:rPr>
+                <w:rFonts w:ascii="Arial" w:cs="Arial" w:eastAsia="Arial" w:hAnsi="Arial"/>
+                <w:color w:val="333333"/>
+              </w:rPr>
+              <w:t xml:space="preserve"> (5 archivos)</w:t>
+            </w:r>
+          </w:p>
+        </w:tc>
+        <w:tc>
+          <w:tcPr>
+            <w:tcW w:type="dxa" w:w="5961"/>
+            <w:shd w:fill="FFFFFF" w:val="clear"/>
+            <w:tcMar>
+              <w:top w:type="dxa" w:w="60"/>
+              <w:left w:type="dxa" w:w="120"/>
+              <w:bottom w:type="dxa" w:w="60"/>
+              <w:right w:type="dxa" w:w="120"/>
+            </w:tcMar>
+          </w:tcPr>
+          <w:p>
+            <w:pPr>
+              <w:spacing w:after="60" w:before="60"/>
+            </w:pPr>
+            <w:r>
+              <w:rPr>
+                <w:rFonts w:ascii="Arial" w:cs="Arial" w:eastAsia="Arial" w:hAnsi="Arial"/>
+                <w:color w:val="333333"/>
+              </w:rPr>
+              <w:t xml:space="preserve">Los cinco prompts para montar el proyecto, listos para copiar y pegar en Copilot</w:t>
+            </w:r>
+          </w:p>
+        </w:tc>
+        <w:tc>
+          <w:tcPr>
+            <w:tcW w:type="dxa" w:w="1052"/>
+            <w:shd w:fill="FFFFFF" w:val="clear"/>
+            <w:tcMar>
+              <w:top w:type="dxa" w:w="60"/>
+              <w:left w:type="dxa" w:w="120"/>
+              <w:bottom w:type="dxa" w:w="60"/>
+              <w:right w:type="dxa" w:w="120"/>
+            </w:tcMar>
+          </w:tcPr>
+          <w:p>
+            <w:pPr>
+              <w:spacing w:after="60" w:before="60"/>
+            </w:pPr>
+            <w:r>
+              <w:rPr>
+                <w:rFonts w:ascii="Arial" w:cs="Arial" w:eastAsia="Arial" w:hAnsi="Arial"/>
+                <w:color w:val="333333"/>
+              </w:rPr>
+              <w:t xml:space="preserve">Módulo 3 · ruta PM</w:t>
+            </w:r>
+          </w:p>
+        </w:tc>
+      </w:tr>
+      <w:tr>
+        <w:tc>
+          <w:tcPr>
+            <w:tcW w:type="dxa" w:w="1987"/>
+            <w:shd w:fill="FFFFFF" w:val="clear"/>
+            <w:tcMar>
+              <w:top w:type="dxa" w:w="60"/>
+              <w:left w:type="dxa" w:w="120"/>
+              <w:bottom w:type="dxa" w:w="60"/>
+              <w:right w:type="dxa" w:w="120"/>
+            </w:tcMar>
+          </w:tcPr>
+          <w:p>
+            <w:pPr>
+              <w:spacing w:after="60" w:before="60"/>
+            </w:pPr>
+            <w:r>
+              <w:rPr>
+                <w:rFonts w:ascii="Courier New" w:cs="Courier New" w:eastAsia="Courier New" w:hAnsi="Courier New"/>
+                <w:color w:val="333333"/>
+              </w:rPr>
+              <w:t xml:space="preserve">.env.example</w:t>
+            </w:r>
+          </w:p>
+        </w:tc>
+        <w:tc>
+          <w:tcPr>
+            <w:tcW w:type="dxa" w:w="5961"/>
+            <w:shd w:fill="FFFFFF" w:val="clear"/>
+            <w:tcMar>
+              <w:top w:type="dxa" w:w="60"/>
+              <w:left w:type="dxa" w:w="120"/>
+              <w:bottom w:type="dxa" w:w="60"/>
+              <w:right w:type="dxa" w:w="120"/>
+            </w:tcMar>
+          </w:tcPr>
+          <w:p>
+            <w:pPr>
+              <w:spacing w:after="60" w:before="60"/>
+            </w:pPr>
+            <w:r>
+              <w:rPr>
+                <w:rFonts w:ascii="Arial" w:cs="Arial" w:eastAsia="Arial" w:hAnsi="Arial"/>
+                <w:color w:val="333333"/>
+              </w:rPr>
+              <w:t xml:space="preserve">El modelo del archivo de claves. Las claves de verdad van en </w:t>
+            </w:r>
+            <w:r>
+              <w:rPr>
+                <w:rFonts w:ascii="Courier New" w:cs="Courier New" w:eastAsia="Courier New" w:hAnsi="Courier New"/>
+                <w:color w:val="333333"/>
+              </w:rPr>
+              <w:t xml:space="preserve">.env.local</w:t>
+            </w:r>
+            <w:r>
+              <w:rPr>
+                <w:rFonts w:ascii="Arial" w:cs="Arial" w:eastAsia="Arial" w:hAnsi="Arial"/>
+                <w:color w:val="333333"/>
+              </w:rPr>
+              <w:t xml:space="preserve">, que es privado</w:t>
+            </w:r>
+          </w:p>
+        </w:tc>
+        <w:tc>
+          <w:tcPr>
+            <w:tcW w:type="dxa" w:w="1052"/>
+            <w:shd w:fill="FFFFFF" w:val="clear"/>
+            <w:tcMar>
+              <w:top w:type="dxa" w:w="60"/>
+              <w:left w:type="dxa" w:w="120"/>
+              <w:bottom w:type="dxa" w:w="60"/>
+              <w:right w:type="dxa" w:w="120"/>
+            </w:tcMar>
+          </w:tcPr>
+          <w:p>
+            <w:pPr>
+              <w:spacing w:after="60" w:before="60"/>
+            </w:pPr>
+            <w:r>
+              <w:rPr>
+                <w:rFonts w:ascii="Arial" w:cs="Arial" w:eastAsia="Arial" w:hAnsi="Arial"/>
+                <w:color w:val="333333"/>
+              </w:rPr>
+              <w:t xml:space="preserve">Módulo 3 · ruta PM</w:t>
             </w:r>
           </w:p>
         </w:tc>

</xml_diff>

<commit_message>
Módulo 3: prompt 06, el ejercicio de la Skill OpenSpec
Co-Authored-By: Claude Opus 5.5 <noreply@anthropic.com>
</commit_message>
<xml_diff>
--- a/LEEME.docx
+++ b/LEEME.docx
@@ -573,9 +573,9 @@
         </w:tblBorders>
       </w:tblPr>
       <w:tblGrid>
-        <w:gridCol w:w="1987"/>
-        <w:gridCol w:w="5961"/>
-        <w:gridCol w:w="1052"/>
+        <w:gridCol w:w="1901"/>
+        <w:gridCol w:w="6093"/>
+        <w:gridCol w:w="1006"/>
       </w:tblGrid>
       <w:tr>
         <w:trPr>
@@ -583,7 +583,7 @@
         </w:trPr>
         <w:tc>
           <w:tcPr>
-            <w:tcW w:type="dxa" w:w="1987"/>
+            <w:tcW w:type="dxa" w:w="1901"/>
             <w:shd w:fill="020857" w:val="clear"/>
             <w:tcMar>
               <w:top w:type="dxa" w:w="60"/>
@@ -609,7 +609,7 @@
         </w:tc>
         <w:tc>
           <w:tcPr>
-            <w:tcW w:type="dxa" w:w="5961"/>
+            <w:tcW w:type="dxa" w:w="6093"/>
             <w:shd w:fill="020857" w:val="clear"/>
             <w:tcMar>
               <w:top w:type="dxa" w:w="60"/>
@@ -635,7 +635,7 @@
         </w:tc>
         <w:tc>
           <w:tcPr>
-            <w:tcW w:type="dxa" w:w="1052"/>
+            <w:tcW w:type="dxa" w:w="1006"/>
             <w:shd w:fill="020857" w:val="clear"/>
             <w:tcMar>
               <w:top w:type="dxa" w:w="60"/>
@@ -663,7 +663,7 @@
       <w:tr>
         <w:tc>
           <w:tcPr>
-            <w:tcW w:type="dxa" w:w="1987"/>
+            <w:tcW w:type="dxa" w:w="1901"/>
             <w:shd w:fill="FFFFFF" w:val="clear"/>
             <w:tcMar>
               <w:top w:type="dxa" w:w="60"/>
@@ -687,7 +687,7 @@
         </w:tc>
         <w:tc>
           <w:tcPr>
-            <w:tcW w:type="dxa" w:w="5961"/>
+            <w:tcW w:type="dxa" w:w="6093"/>
             <w:shd w:fill="FFFFFF" w:val="clear"/>
             <w:tcMar>
               <w:top w:type="dxa" w:w="60"/>
@@ -734,7 +734,7 @@
         </w:tc>
         <w:tc>
           <w:tcPr>
-            <w:tcW w:type="dxa" w:w="1052"/>
+            <w:tcW w:type="dxa" w:w="1006"/>
             <w:shd w:fill="FFFFFF" w:val="clear"/>
             <w:tcMar>
               <w:top w:type="dxa" w:w="60"/>
@@ -760,7 +760,7 @@
       <w:tr>
         <w:tc>
           <w:tcPr>
-            <w:tcW w:type="dxa" w:w="1987"/>
+            <w:tcW w:type="dxa" w:w="1901"/>
             <w:shd w:fill="FFFFFF" w:val="clear"/>
             <w:tcMar>
               <w:top w:type="dxa" w:w="60"/>
@@ -784,7 +784,7 @@
         </w:tc>
         <w:tc>
           <w:tcPr>
-            <w:tcW w:type="dxa" w:w="5961"/>
+            <w:tcW w:type="dxa" w:w="6093"/>
             <w:shd w:fill="FFFFFF" w:val="clear"/>
             <w:tcMar>
               <w:top w:type="dxa" w:w="60"/>
@@ -822,7 +822,7 @@
         </w:tc>
         <w:tc>
           <w:tcPr>
-            <w:tcW w:type="dxa" w:w="1052"/>
+            <w:tcW w:type="dxa" w:w="1006"/>
             <w:shd w:fill="FFFFFF" w:val="clear"/>
             <w:tcMar>
               <w:top w:type="dxa" w:w="60"/>
@@ -848,7 +848,7 @@
       <w:tr>
         <w:tc>
           <w:tcPr>
-            <w:tcW w:type="dxa" w:w="1987"/>
+            <w:tcW w:type="dxa" w:w="1901"/>
             <w:shd w:fill="FFFFFF" w:val="clear"/>
             <w:tcMar>
               <w:top w:type="dxa" w:w="60"/>
@@ -872,7 +872,7 @@
         </w:tc>
         <w:tc>
           <w:tcPr>
-            <w:tcW w:type="dxa" w:w="5961"/>
+            <w:tcW w:type="dxa" w:w="6093"/>
             <w:shd w:fill="FFFFFF" w:val="clear"/>
             <w:tcMar>
               <w:top w:type="dxa" w:w="60"/>
@@ -912,7 +912,7 @@
         </w:tc>
         <w:tc>
           <w:tcPr>
-            <w:tcW w:type="dxa" w:w="1052"/>
+            <w:tcW w:type="dxa" w:w="1006"/>
             <w:shd w:fill="FFFFFF" w:val="clear"/>
             <w:tcMar>
               <w:top w:type="dxa" w:w="60"/>
@@ -938,7 +938,7 @@
       <w:tr>
         <w:tc>
           <w:tcPr>
-            <w:tcW w:type="dxa" w:w="1987"/>
+            <w:tcW w:type="dxa" w:w="1901"/>
             <w:shd w:fill="FFFFFF" w:val="clear"/>
             <w:tcMar>
               <w:top w:type="dxa" w:w="60"/>
@@ -962,7 +962,7 @@
         </w:tc>
         <w:tc>
           <w:tcPr>
-            <w:tcW w:type="dxa" w:w="5961"/>
+            <w:tcW w:type="dxa" w:w="6093"/>
             <w:shd w:fill="FFFFFF" w:val="clear"/>
             <w:tcMar>
               <w:top w:type="dxa" w:w="60"/>
@@ -986,7 +986,7 @@
         </w:tc>
         <w:tc>
           <w:tcPr>
-            <w:tcW w:type="dxa" w:w="1052"/>
+            <w:tcW w:type="dxa" w:w="1006"/>
             <w:shd w:fill="FFFFFF" w:val="clear"/>
             <w:tcMar>
               <w:top w:type="dxa" w:w="60"/>
@@ -1012,7 +1012,7 @@
       <w:tr>
         <w:tc>
           <w:tcPr>
-            <w:tcW w:type="dxa" w:w="1987"/>
+            <w:tcW w:type="dxa" w:w="1901"/>
             <w:shd w:fill="FFFFFF" w:val="clear"/>
             <w:tcMar>
               <w:top w:type="dxa" w:w="60"/>
@@ -1043,7 +1043,7 @@
         </w:tc>
         <w:tc>
           <w:tcPr>
-            <w:tcW w:type="dxa" w:w="5961"/>
+            <w:tcW w:type="dxa" w:w="6093"/>
             <w:shd w:fill="FFFFFF" w:val="clear"/>
             <w:tcMar>
               <w:top w:type="dxa" w:w="60"/>
@@ -1067,7 +1067,7 @@
         </w:tc>
         <w:tc>
           <w:tcPr>
-            <w:tcW w:type="dxa" w:w="1052"/>
+            <w:tcW w:type="dxa" w:w="1006"/>
             <w:shd w:fill="FFFFFF" w:val="clear"/>
             <w:tcMar>
               <w:top w:type="dxa" w:w="60"/>
@@ -1093,7 +1093,7 @@
       <w:tr>
         <w:tc>
           <w:tcPr>
-            <w:tcW w:type="dxa" w:w="1987"/>
+            <w:tcW w:type="dxa" w:w="1901"/>
             <w:shd w:fill="FFFFFF" w:val="clear"/>
             <w:tcMar>
               <w:top w:type="dxa" w:w="60"/>
@@ -1117,7 +1117,7 @@
         </w:tc>
         <w:tc>
           <w:tcPr>
-            <w:tcW w:type="dxa" w:w="5961"/>
+            <w:tcW w:type="dxa" w:w="6093"/>
             <w:shd w:fill="FFFFFF" w:val="clear"/>
             <w:tcMar>
               <w:top w:type="dxa" w:w="60"/>
@@ -1141,7 +1141,7 @@
         </w:tc>
         <w:tc>
           <w:tcPr>
-            <w:tcW w:type="dxa" w:w="1052"/>
+            <w:tcW w:type="dxa" w:w="1006"/>
             <w:shd w:fill="FFFFFF" w:val="clear"/>
             <w:tcMar>
               <w:top w:type="dxa" w:w="60"/>
@@ -1167,7 +1167,7 @@
       <w:tr>
         <w:tc>
           <w:tcPr>
-            <w:tcW w:type="dxa" w:w="1987"/>
+            <w:tcW w:type="dxa" w:w="1901"/>
             <w:shd w:fill="FFFFFF" w:val="clear"/>
             <w:tcMar>
               <w:top w:type="dxa" w:w="60"/>
@@ -1191,7 +1191,7 @@
         </w:tc>
         <w:tc>
           <w:tcPr>
-            <w:tcW w:type="dxa" w:w="5961"/>
+            <w:tcW w:type="dxa" w:w="6093"/>
             <w:shd w:fill="FFFFFF" w:val="clear"/>
             <w:tcMar>
               <w:top w:type="dxa" w:w="60"/>
@@ -1215,7 +1215,7 @@
         </w:tc>
         <w:tc>
           <w:tcPr>
-            <w:tcW w:type="dxa" w:w="1052"/>
+            <w:tcW w:type="dxa" w:w="1006"/>
             <w:shd w:fill="FFFFFF" w:val="clear"/>
             <w:tcMar>
               <w:top w:type="dxa" w:w="60"/>
@@ -1241,7 +1241,7 @@
       <w:tr>
         <w:tc>
           <w:tcPr>
-            <w:tcW w:type="dxa" w:w="1987"/>
+            <w:tcW w:type="dxa" w:w="1901"/>
             <w:shd w:fill="FFFFFF" w:val="clear"/>
             <w:tcMar>
               <w:top w:type="dxa" w:w="60"/>
@@ -1265,7 +1265,7 @@
         </w:tc>
         <w:tc>
           <w:tcPr>
-            <w:tcW w:type="dxa" w:w="5961"/>
+            <w:tcW w:type="dxa" w:w="6093"/>
             <w:shd w:fill="FFFFFF" w:val="clear"/>
             <w:tcMar>
               <w:top w:type="dxa" w:w="60"/>
@@ -1289,7 +1289,7 @@
         </w:tc>
         <w:tc>
           <w:tcPr>
-            <w:tcW w:type="dxa" w:w="1052"/>
+            <w:tcW w:type="dxa" w:w="1006"/>
             <w:shd w:fill="FFFFFF" w:val="clear"/>
             <w:tcMar>
               <w:top w:type="dxa" w:w="60"/>
@@ -1315,7 +1315,7 @@
       <w:tr>
         <w:tc>
           <w:tcPr>
-            <w:tcW w:type="dxa" w:w="1987"/>
+            <w:tcW w:type="dxa" w:w="1901"/>
             <w:shd w:fill="FFFFFF" w:val="clear"/>
             <w:tcMar>
               <w:top w:type="dxa" w:w="60"/>
@@ -1340,55 +1340,55 @@
                 <w:rFonts w:ascii="Arial" w:cs="Arial" w:eastAsia="Arial" w:hAnsi="Arial"/>
                 <w:color w:val="333333"/>
               </w:rPr>
-              <w:t xml:space="preserve"> (5 archivos)</w:t>
-            </w:r>
-          </w:p>
-        </w:tc>
-        <w:tc>
-          <w:tcPr>
-            <w:tcW w:type="dxa" w:w="5961"/>
-            <w:shd w:fill="FFFFFF" w:val="clear"/>
-            <w:tcMar>
-              <w:top w:type="dxa" w:w="60"/>
-              <w:left w:type="dxa" w:w="120"/>
-              <w:bottom w:type="dxa" w:w="60"/>
-              <w:right w:type="dxa" w:w="120"/>
-            </w:tcMar>
-          </w:tcPr>
-          <w:p>
-            <w:pPr>
-              <w:spacing w:after="60" w:before="60"/>
-            </w:pPr>
-            <w:r>
-              <w:rPr>
-                <w:rFonts w:ascii="Arial" w:cs="Arial" w:eastAsia="Arial" w:hAnsi="Arial"/>
-                <w:color w:val="333333"/>
-              </w:rPr>
-              <w:t xml:space="preserve">Los cinco prompts para montar el proyecto, listos para copiar y pegar en Copilot</w:t>
-            </w:r>
-          </w:p>
-        </w:tc>
-        <w:tc>
-          <w:tcPr>
-            <w:tcW w:type="dxa" w:w="1052"/>
-            <w:shd w:fill="FFFFFF" w:val="clear"/>
-            <w:tcMar>
-              <w:top w:type="dxa" w:w="60"/>
-              <w:left w:type="dxa" w:w="120"/>
-              <w:bottom w:type="dxa" w:w="60"/>
-              <w:right w:type="dxa" w:w="120"/>
-            </w:tcMar>
-          </w:tcPr>
-          <w:p>
-            <w:pPr>
-              <w:spacing w:after="60" w:before="60"/>
-            </w:pPr>
-            <w:r>
-              <w:rPr>
-                <w:rFonts w:ascii="Arial" w:cs="Arial" w:eastAsia="Arial" w:hAnsi="Arial"/>
-                <w:color w:val="333333"/>
-              </w:rPr>
-              <w:t xml:space="preserve">Módulo 3 · ruta PM</w:t>
+              <w:t xml:space="preserve"> (6 archivos)</w:t>
+            </w:r>
+          </w:p>
+        </w:tc>
+        <w:tc>
+          <w:tcPr>
+            <w:tcW w:type="dxa" w:w="6093"/>
+            <w:shd w:fill="FFFFFF" w:val="clear"/>
+            <w:tcMar>
+              <w:top w:type="dxa" w:w="60"/>
+              <w:left w:type="dxa" w:w="120"/>
+              <w:bottom w:type="dxa" w:w="60"/>
+              <w:right w:type="dxa" w:w="120"/>
+            </w:tcMar>
+          </w:tcPr>
+          <w:p>
+            <w:pPr>
+              <w:spacing w:after="60" w:before="60"/>
+            </w:pPr>
+            <w:r>
+              <w:rPr>
+                <w:rFonts w:ascii="Arial" w:cs="Arial" w:eastAsia="Arial" w:hAnsi="Arial"/>
+                <w:color w:val="333333"/>
+              </w:rPr>
+              <w:t xml:space="preserve">Los cinco prompts para montar el proyecto y el del ejercicio de Skills, listos para copiar y pegar en Copilot</w:t>
+            </w:r>
+          </w:p>
+        </w:tc>
+        <w:tc>
+          <w:tcPr>
+            <w:tcW w:type="dxa" w:w="1006"/>
+            <w:shd w:fill="FFFFFF" w:val="clear"/>
+            <w:tcMar>
+              <w:top w:type="dxa" w:w="60"/>
+              <w:left w:type="dxa" w:w="120"/>
+              <w:bottom w:type="dxa" w:w="60"/>
+              <w:right w:type="dxa" w:w="120"/>
+            </w:tcMar>
+          </w:tcPr>
+          <w:p>
+            <w:pPr>
+              <w:spacing w:after="60" w:before="60"/>
+            </w:pPr>
+            <w:r>
+              <w:rPr>
+                <w:rFonts w:ascii="Arial" w:cs="Arial" w:eastAsia="Arial" w:hAnsi="Arial"/>
+                <w:color w:val="333333"/>
+              </w:rPr>
+              <w:t xml:space="preserve">Módulo 3</w:t>
             </w:r>
           </w:p>
         </w:tc>
@@ -1396,7 +1396,7 @@
       <w:tr>
         <w:tc>
           <w:tcPr>
-            <w:tcW w:type="dxa" w:w="1987"/>
+            <w:tcW w:type="dxa" w:w="1901"/>
             <w:shd w:fill="FFFFFF" w:val="clear"/>
             <w:tcMar>
               <w:top w:type="dxa" w:w="60"/>
@@ -1420,7 +1420,7 @@
         </w:tc>
         <w:tc>
           <w:tcPr>
-            <w:tcW w:type="dxa" w:w="5961"/>
+            <w:tcW w:type="dxa" w:w="6093"/>
             <w:shd w:fill="FFFFFF" w:val="clear"/>
             <w:tcMar>
               <w:top w:type="dxa" w:w="60"/>
@@ -1458,7 +1458,7 @@
         </w:tc>
         <w:tc>
           <w:tcPr>
-            <w:tcW w:type="dxa" w:w="1052"/>
+            <w:tcW w:type="dxa" w:w="1006"/>
             <w:shd w:fill="FFFFFF" w:val="clear"/>
             <w:tcMar>
               <w:top w:type="dxa" w:w="60"/>

</xml_diff>

<commit_message>
LEEME: el Módulo 3 lo hacen todos igual (sin rutas PM/PO)
Co-Authored-By: Claude Opus 5.5 <noreply@anthropic.com>
</commit_message>
<xml_diff>
--- a/LEEME.docx
+++ b/LEEME.docx
@@ -85,9 +85,9 @@
         </w:tblBorders>
       </w:tblPr>
       <w:tblGrid>
-        <w:gridCol w:w="2652"/>
-        <w:gridCol w:w="4580"/>
-        <w:gridCol w:w="1768"/>
+        <w:gridCol w:w="2560"/>
+        <w:gridCol w:w="4422"/>
+        <w:gridCol w:w="2017"/>
       </w:tblGrid>
       <w:tr>
         <w:trPr>
@@ -95,7 +95,7 @@
         </w:trPr>
         <w:tc>
           <w:tcPr>
-            <w:tcW w:type="dxa" w:w="2652"/>
+            <w:tcW w:type="dxa" w:w="2560"/>
             <w:shd w:fill="020857" w:val="clear"/>
             <w:tcMar>
               <w:top w:type="dxa" w:w="60"/>
@@ -121,7 +121,7 @@
         </w:tc>
         <w:tc>
           <w:tcPr>
-            <w:tcW w:type="dxa" w:w="4580"/>
+            <w:tcW w:type="dxa" w:w="4422"/>
             <w:shd w:fill="020857" w:val="clear"/>
             <w:tcMar>
               <w:top w:type="dxa" w:w="60"/>
@@ -147,7 +147,7 @@
         </w:tc>
         <w:tc>
           <w:tcPr>
-            <w:tcW w:type="dxa" w:w="1768"/>
+            <w:tcW w:type="dxa" w:w="2017"/>
             <w:shd w:fill="020857" w:val="clear"/>
             <w:tcMar>
               <w:top w:type="dxa" w:w="60"/>
@@ -175,7 +175,7 @@
       <w:tr>
         <w:tc>
           <w:tcPr>
-            <w:tcW w:type="dxa" w:w="2652"/>
+            <w:tcW w:type="dxa" w:w="2560"/>
             <w:shd w:fill="FFFFFF" w:val="clear"/>
             <w:tcMar>
               <w:top w:type="dxa" w:w="60"/>
@@ -201,7 +201,7 @@
         </w:tc>
         <w:tc>
           <w:tcPr>
-            <w:tcW w:type="dxa" w:w="4580"/>
+            <w:tcW w:type="dxa" w:w="4422"/>
             <w:shd w:fill="FFFFFF" w:val="clear"/>
             <w:tcMar>
               <w:top w:type="dxa" w:w="60"/>
@@ -225,7 +225,7 @@
         </w:tc>
         <w:tc>
           <w:tcPr>
-            <w:tcW w:type="dxa" w:w="1768"/>
+            <w:tcW w:type="dxa" w:w="2017"/>
             <w:shd w:fill="FFFFFF" w:val="clear"/>
             <w:tcMar>
               <w:top w:type="dxa" w:w="60"/>
@@ -251,7 +251,7 @@
       <w:tr>
         <w:tc>
           <w:tcPr>
-            <w:tcW w:type="dxa" w:w="2652"/>
+            <w:tcW w:type="dxa" w:w="2560"/>
             <w:shd w:fill="FFFFFF" w:val="clear"/>
             <w:tcMar>
               <w:top w:type="dxa" w:w="60"/>
@@ -284,7 +284,7 @@
         </w:tc>
         <w:tc>
           <w:tcPr>
-            <w:tcW w:type="dxa" w:w="4580"/>
+            <w:tcW w:type="dxa" w:w="4422"/>
             <w:shd w:fill="FFFFFF" w:val="clear"/>
             <w:tcMar>
               <w:top w:type="dxa" w:w="60"/>
@@ -308,7 +308,7 @@
         </w:tc>
         <w:tc>
           <w:tcPr>
-            <w:tcW w:type="dxa" w:w="1768"/>
+            <w:tcW w:type="dxa" w:w="2017"/>
             <w:shd w:fill="FFFFFF" w:val="clear"/>
             <w:tcMar>
               <w:top w:type="dxa" w:w="60"/>
@@ -334,7 +334,7 @@
       <w:tr>
         <w:tc>
           <w:tcPr>
-            <w:tcW w:type="dxa" w:w="2652"/>
+            <w:tcW w:type="dxa" w:w="2560"/>
             <w:shd w:fill="FFFFFF" w:val="clear"/>
             <w:tcMar>
               <w:top w:type="dxa" w:w="60"/>
@@ -360,7 +360,7 @@
         </w:tc>
         <w:tc>
           <w:tcPr>
-            <w:tcW w:type="dxa" w:w="4580"/>
+            <w:tcW w:type="dxa" w:w="4422"/>
             <w:shd w:fill="FFFFFF" w:val="clear"/>
             <w:tcMar>
               <w:top w:type="dxa" w:w="60"/>
@@ -384,7 +384,7 @@
         </w:tc>
         <w:tc>
           <w:tcPr>
-            <w:tcW w:type="dxa" w:w="1768"/>
+            <w:tcW w:type="dxa" w:w="2017"/>
             <w:shd w:fill="FFFFFF" w:val="clear"/>
             <w:tcMar>
               <w:top w:type="dxa" w:w="60"/>
@@ -410,7 +410,7 @@
       <w:tr>
         <w:tc>
           <w:tcPr>
-            <w:tcW w:type="dxa" w:w="2652"/>
+            <w:tcW w:type="dxa" w:w="2560"/>
             <w:shd w:fill="FFFFFF" w:val="clear"/>
             <w:tcMar>
               <w:top w:type="dxa" w:w="60"/>
@@ -443,7 +443,7 @@
         </w:tc>
         <w:tc>
           <w:tcPr>
-            <w:tcW w:type="dxa" w:w="4580"/>
+            <w:tcW w:type="dxa" w:w="4422"/>
             <w:shd w:fill="FFFFFF" w:val="clear"/>
             <w:tcMar>
               <w:top w:type="dxa" w:w="60"/>
@@ -467,27 +467,25 @@
         </w:tc>
         <w:tc>
           <w:tcPr>
-            <w:tcW w:type="dxa" w:w="1768"/>
-            <w:shd w:fill="FFFFFF" w:val="clear"/>
-            <w:tcMar>
-              <w:top w:type="dxa" w:w="60"/>
-              <w:left w:type="dxa" w:w="120"/>
-              <w:bottom w:type="dxa" w:w="60"/>
-              <w:right w:type="dxa" w:w="120"/>
-            </w:tcMar>
-          </w:tcPr>
-          <w:p>
-            <w:pPr>
-              <w:spacing w:after="60" w:before="60"/>
-            </w:pPr>
-            <w:r>
-              <w:rPr>
-                <w:rFonts w:ascii="Arial" w:cs="Arial" w:eastAsia="Arial" w:hAnsi="Arial"/>
-                <w:b/>
-                <w:bCs/>
-                <w:color w:val="333333"/>
-              </w:rPr>
-              <w:t xml:space="preserve">Solo ruta PM</w:t>
+            <w:tcW w:type="dxa" w:w="2017"/>
+            <w:shd w:fill="FFFFFF" w:val="clear"/>
+            <w:tcMar>
+              <w:top w:type="dxa" w:w="60"/>
+              <w:left w:type="dxa" w:w="120"/>
+              <w:bottom w:type="dxa" w:w="60"/>
+              <w:right w:type="dxa" w:w="120"/>
+            </w:tcMar>
+          </w:tcPr>
+          <w:p>
+            <w:pPr>
+              <w:spacing w:after="60" w:before="60"/>
+            </w:pPr>
+            <w:r>
+              <w:rPr>
+                <w:rFonts w:ascii="Arial" w:cs="Arial" w:eastAsia="Arial" w:hAnsi="Arial"/>
+                <w:color w:val="333333"/>
+              </w:rPr>
+              <w:t xml:space="preserve">Todos · antes del Módulo 3</w:t>
             </w:r>
           </w:p>
         </w:tc>
@@ -1085,7 +1083,7 @@
                 <w:rFonts w:ascii="Arial" w:cs="Arial" w:eastAsia="Arial" w:hAnsi="Arial"/>
                 <w:color w:val="333333"/>
               </w:rPr>
-              <w:t xml:space="preserve">Módulo 3 · ruta PM</w:t>
+              <w:t xml:space="preserve">Módulo 3</w:t>
             </w:r>
           </w:p>
         </w:tc>
@@ -1159,7 +1157,7 @@
                 <w:rFonts w:ascii="Arial" w:cs="Arial" w:eastAsia="Arial" w:hAnsi="Arial"/>
                 <w:color w:val="333333"/>
               </w:rPr>
-              <w:t xml:space="preserve">Módulo 3 · ruta PM</w:t>
+              <w:t xml:space="preserve">Módulo 3</w:t>
             </w:r>
           </w:p>
         </w:tc>
@@ -1233,7 +1231,7 @@
                 <w:rFonts w:ascii="Arial" w:cs="Arial" w:eastAsia="Arial" w:hAnsi="Arial"/>
                 <w:color w:val="333333"/>
               </w:rPr>
-              <w:t xml:space="preserve">Módulo 5 · ruta PM</w:t>
+              <w:t xml:space="preserve">Módulo 5</w:t>
             </w:r>
           </w:p>
         </w:tc>
@@ -1259,7 +1257,14 @@
                 <w:rFonts w:ascii="Courier New" w:cs="Courier New" w:eastAsia="Courier New" w:hAnsi="Courier New"/>
                 <w:color w:val="333333"/>
               </w:rPr>
-              <w:t xml:space="preserve">assets/datos-ejemplo.ts</w:t>
+              <w:t xml:space="preserve">prompts/</w:t>
+            </w:r>
+            <w:r>
+              <w:rPr>
+                <w:rFonts w:ascii="Arial" w:cs="Arial" w:eastAsia="Arial" w:hAnsi="Arial"/>
+                <w:color w:val="333333"/>
+              </w:rPr>
+              <w:t xml:space="preserve"> (6 archivos)</w:t>
             </w:r>
           </w:p>
         </w:tc>
@@ -1283,7 +1288,7 @@
                 <w:rFonts w:ascii="Arial" w:cs="Arial" w:eastAsia="Arial" w:hAnsi="Arial"/>
                 <w:color w:val="333333"/>
               </w:rPr>
-              <w:t xml:space="preserve">Los mismos datos, en un archivo, sin base de datos</w:t>
+              <w:t xml:space="preserve">Los cinco prompts para montar el proyecto y el del ejercicio de Skills, listos para copiar y pegar en Copilot</w:t>
             </w:r>
           </w:p>
         </w:tc>
@@ -1307,7 +1312,7 @@
                 <w:rFonts w:ascii="Arial" w:cs="Arial" w:eastAsia="Arial" w:hAnsi="Arial"/>
                 <w:color w:val="333333"/>
               </w:rPr>
-              <w:t xml:space="preserve">Módulo 3 · ruta PO</w:t>
+              <w:t xml:space="preserve">Módulo 3</w:t>
             </w:r>
           </w:p>
         </w:tc>
@@ -1333,14 +1338,7 @@
                 <w:rFonts w:ascii="Courier New" w:cs="Courier New" w:eastAsia="Courier New" w:hAnsi="Courier New"/>
                 <w:color w:val="333333"/>
               </w:rPr>
-              <w:t xml:space="preserve">prompts/</w:t>
-            </w:r>
-            <w:r>
-              <w:rPr>
-                <w:rFonts w:ascii="Arial" w:cs="Arial" w:eastAsia="Arial" w:hAnsi="Arial"/>
-                <w:color w:val="333333"/>
-              </w:rPr>
-              <w:t xml:space="preserve"> (6 archivos)</w:t>
+              <w:t xml:space="preserve">.env.example</w:t>
             </w:r>
           </w:p>
         </w:tc>
@@ -1364,7 +1362,21 @@
                 <w:rFonts w:ascii="Arial" w:cs="Arial" w:eastAsia="Arial" w:hAnsi="Arial"/>
                 <w:color w:val="333333"/>
               </w:rPr>
-              <w:t xml:space="preserve">Los cinco prompts para montar el proyecto y el del ejercicio de Skills, listos para copiar y pegar en Copilot</w:t>
+              <w:t xml:space="preserve">El modelo del archivo de claves. Las claves de verdad van en </w:t>
+            </w:r>
+            <w:r>
+              <w:rPr>
+                <w:rFonts w:ascii="Courier New" w:cs="Courier New" w:eastAsia="Courier New" w:hAnsi="Courier New"/>
+                <w:color w:val="333333"/>
+              </w:rPr>
+              <w:t xml:space="preserve">.env.local</w:t>
+            </w:r>
+            <w:r>
+              <w:rPr>
+                <w:rFonts w:ascii="Arial" w:cs="Arial" w:eastAsia="Arial" w:hAnsi="Arial"/>
+                <w:color w:val="333333"/>
+              </w:rPr>
+              <w:t xml:space="preserve">, que es privado</w:t>
             </w:r>
           </w:p>
         </w:tc>
@@ -1389,94 +1401,6 @@
                 <w:color w:val="333333"/>
               </w:rPr>
               <w:t xml:space="preserve">Módulo 3</w:t>
-            </w:r>
-          </w:p>
-        </w:tc>
-      </w:tr>
-      <w:tr>
-        <w:tc>
-          <w:tcPr>
-            <w:tcW w:type="dxa" w:w="1901"/>
-            <w:shd w:fill="FFFFFF" w:val="clear"/>
-            <w:tcMar>
-              <w:top w:type="dxa" w:w="60"/>
-              <w:left w:type="dxa" w:w="120"/>
-              <w:bottom w:type="dxa" w:w="60"/>
-              <w:right w:type="dxa" w:w="120"/>
-            </w:tcMar>
-          </w:tcPr>
-          <w:p>
-            <w:pPr>
-              <w:spacing w:after="60" w:before="60"/>
-            </w:pPr>
-            <w:r>
-              <w:rPr>
-                <w:rFonts w:ascii="Courier New" w:cs="Courier New" w:eastAsia="Courier New" w:hAnsi="Courier New"/>
-                <w:color w:val="333333"/>
-              </w:rPr>
-              <w:t xml:space="preserve">.env.example</w:t>
-            </w:r>
-          </w:p>
-        </w:tc>
-        <w:tc>
-          <w:tcPr>
-            <w:tcW w:type="dxa" w:w="6093"/>
-            <w:shd w:fill="FFFFFF" w:val="clear"/>
-            <w:tcMar>
-              <w:top w:type="dxa" w:w="60"/>
-              <w:left w:type="dxa" w:w="120"/>
-              <w:bottom w:type="dxa" w:w="60"/>
-              <w:right w:type="dxa" w:w="120"/>
-            </w:tcMar>
-          </w:tcPr>
-          <w:p>
-            <w:pPr>
-              <w:spacing w:after="60" w:before="60"/>
-            </w:pPr>
-            <w:r>
-              <w:rPr>
-                <w:rFonts w:ascii="Arial" w:cs="Arial" w:eastAsia="Arial" w:hAnsi="Arial"/>
-                <w:color w:val="333333"/>
-              </w:rPr>
-              <w:t xml:space="preserve">El modelo del archivo de claves. Las claves de verdad van en </w:t>
-            </w:r>
-            <w:r>
-              <w:rPr>
-                <w:rFonts w:ascii="Courier New" w:cs="Courier New" w:eastAsia="Courier New" w:hAnsi="Courier New"/>
-                <w:color w:val="333333"/>
-              </w:rPr>
-              <w:t xml:space="preserve">.env.local</w:t>
-            </w:r>
-            <w:r>
-              <w:rPr>
-                <w:rFonts w:ascii="Arial" w:cs="Arial" w:eastAsia="Arial" w:hAnsi="Arial"/>
-                <w:color w:val="333333"/>
-              </w:rPr>
-              <w:t xml:space="preserve">, que es privado</w:t>
-            </w:r>
-          </w:p>
-        </w:tc>
-        <w:tc>
-          <w:tcPr>
-            <w:tcW w:type="dxa" w:w="1006"/>
-            <w:shd w:fill="FFFFFF" w:val="clear"/>
-            <w:tcMar>
-              <w:top w:type="dxa" w:w="60"/>
-              <w:left w:type="dxa" w:w="120"/>
-              <w:bottom w:type="dxa" w:w="60"/>
-              <w:right w:type="dxa" w:w="120"/>
-            </w:tcMar>
-          </w:tcPr>
-          <w:p>
-            <w:pPr>
-              <w:spacing w:after="60" w:before="60"/>
-            </w:pPr>
-            <w:r>
-              <w:rPr>
-                <w:rFonts w:ascii="Arial" w:cs="Arial" w:eastAsia="Arial" w:hAnsi="Arial"/>
-                <w:color w:val="333333"/>
-              </w:rPr>
-              <w:t xml:space="preserve">Módulo 3 · ruta PM</w:t>
             </w:r>
           </w:p>
         </w:tc>

</xml_diff>

<commit_message>
LEEME: la cuenta de Supabase se crea en clase
Co-Authored-By: Claude Opus 5.5 <noreply@anthropic.com>
</commit_message>
<xml_diff>
--- a/LEEME.docx
+++ b/LEEME.docx
@@ -85,9 +85,9 @@
         </w:tblBorders>
       </w:tblPr>
       <w:tblGrid>
-        <w:gridCol w:w="2560"/>
-        <w:gridCol w:w="4422"/>
-        <w:gridCol w:w="2017"/>
+        <w:gridCol w:w="2434"/>
+        <w:gridCol w:w="4205"/>
+        <w:gridCol w:w="2361"/>
       </w:tblGrid>
       <w:tr>
         <w:trPr>
@@ -95,7 +95,7 @@
         </w:trPr>
         <w:tc>
           <w:tcPr>
-            <w:tcW w:type="dxa" w:w="2560"/>
+            <w:tcW w:type="dxa" w:w="2434"/>
             <w:shd w:fill="020857" w:val="clear"/>
             <w:tcMar>
               <w:top w:type="dxa" w:w="60"/>
@@ -121,7 +121,7 @@
         </w:tc>
         <w:tc>
           <w:tcPr>
-            <w:tcW w:type="dxa" w:w="4422"/>
+            <w:tcW w:type="dxa" w:w="4205"/>
             <w:shd w:fill="020857" w:val="clear"/>
             <w:tcMar>
               <w:top w:type="dxa" w:w="60"/>
@@ -147,7 +147,7 @@
         </w:tc>
         <w:tc>
           <w:tcPr>
-            <w:tcW w:type="dxa" w:w="2017"/>
+            <w:tcW w:type="dxa" w:w="2361"/>
             <w:shd w:fill="020857" w:val="clear"/>
             <w:tcMar>
               <w:top w:type="dxa" w:w="60"/>
@@ -175,7 +175,7 @@
       <w:tr>
         <w:tc>
           <w:tcPr>
-            <w:tcW w:type="dxa" w:w="2560"/>
+            <w:tcW w:type="dxa" w:w="2434"/>
             <w:shd w:fill="FFFFFF" w:val="clear"/>
             <w:tcMar>
               <w:top w:type="dxa" w:w="60"/>
@@ -201,7 +201,7 @@
         </w:tc>
         <w:tc>
           <w:tcPr>
-            <w:tcW w:type="dxa" w:w="4422"/>
+            <w:tcW w:type="dxa" w:w="4205"/>
             <w:shd w:fill="FFFFFF" w:val="clear"/>
             <w:tcMar>
               <w:top w:type="dxa" w:w="60"/>
@@ -225,7 +225,7 @@
         </w:tc>
         <w:tc>
           <w:tcPr>
-            <w:tcW w:type="dxa" w:w="2017"/>
+            <w:tcW w:type="dxa" w:w="2361"/>
             <w:shd w:fill="FFFFFF" w:val="clear"/>
             <w:tcMar>
               <w:top w:type="dxa" w:w="60"/>
@@ -251,7 +251,7 @@
       <w:tr>
         <w:tc>
           <w:tcPr>
-            <w:tcW w:type="dxa" w:w="2560"/>
+            <w:tcW w:type="dxa" w:w="2434"/>
             <w:shd w:fill="FFFFFF" w:val="clear"/>
             <w:tcMar>
               <w:top w:type="dxa" w:w="60"/>
@@ -284,7 +284,7 @@
         </w:tc>
         <w:tc>
           <w:tcPr>
-            <w:tcW w:type="dxa" w:w="4422"/>
+            <w:tcW w:type="dxa" w:w="4205"/>
             <w:shd w:fill="FFFFFF" w:val="clear"/>
             <w:tcMar>
               <w:top w:type="dxa" w:w="60"/>
@@ -308,7 +308,7 @@
         </w:tc>
         <w:tc>
           <w:tcPr>
-            <w:tcW w:type="dxa" w:w="2017"/>
+            <w:tcW w:type="dxa" w:w="2361"/>
             <w:shd w:fill="FFFFFF" w:val="clear"/>
             <w:tcMar>
               <w:top w:type="dxa" w:w="60"/>
@@ -334,7 +334,7 @@
       <w:tr>
         <w:tc>
           <w:tcPr>
-            <w:tcW w:type="dxa" w:w="2560"/>
+            <w:tcW w:type="dxa" w:w="2434"/>
             <w:shd w:fill="FFFFFF" w:val="clear"/>
             <w:tcMar>
               <w:top w:type="dxa" w:w="60"/>
@@ -360,7 +360,7 @@
         </w:tc>
         <w:tc>
           <w:tcPr>
-            <w:tcW w:type="dxa" w:w="4422"/>
+            <w:tcW w:type="dxa" w:w="4205"/>
             <w:shd w:fill="FFFFFF" w:val="clear"/>
             <w:tcMar>
               <w:top w:type="dxa" w:w="60"/>
@@ -384,7 +384,7 @@
         </w:tc>
         <w:tc>
           <w:tcPr>
-            <w:tcW w:type="dxa" w:w="2017"/>
+            <w:tcW w:type="dxa" w:w="2361"/>
             <w:shd w:fill="FFFFFF" w:val="clear"/>
             <w:tcMar>
               <w:top w:type="dxa" w:w="60"/>
@@ -410,7 +410,7 @@
       <w:tr>
         <w:tc>
           <w:tcPr>
-            <w:tcW w:type="dxa" w:w="2560"/>
+            <w:tcW w:type="dxa" w:w="2434"/>
             <w:shd w:fill="FFFFFF" w:val="clear"/>
             <w:tcMar>
               <w:top w:type="dxa" w:w="60"/>
@@ -443,7 +443,7 @@
         </w:tc>
         <w:tc>
           <w:tcPr>
-            <w:tcW w:type="dxa" w:w="4422"/>
+            <w:tcW w:type="dxa" w:w="4205"/>
             <w:shd w:fill="FFFFFF" w:val="clear"/>
             <w:tcMar>
               <w:top w:type="dxa" w:w="60"/>
@@ -467,25 +467,25 @@
         </w:tc>
         <w:tc>
           <w:tcPr>
-            <w:tcW w:type="dxa" w:w="2017"/>
-            <w:shd w:fill="FFFFFF" w:val="clear"/>
-            <w:tcMar>
-              <w:top w:type="dxa" w:w="60"/>
-              <w:left w:type="dxa" w:w="120"/>
-              <w:bottom w:type="dxa" w:w="60"/>
-              <w:right w:type="dxa" w:w="120"/>
-            </w:tcMar>
-          </w:tcPr>
-          <w:p>
-            <w:pPr>
-              <w:spacing w:after="60" w:before="60"/>
-            </w:pPr>
-            <w:r>
-              <w:rPr>
-                <w:rFonts w:ascii="Arial" w:cs="Arial" w:eastAsia="Arial" w:hAnsi="Arial"/>
-                <w:color w:val="333333"/>
-              </w:rPr>
-              <w:t xml:space="preserve">Todos · antes del Módulo 3</w:t>
+            <w:tcW w:type="dxa" w:w="2361"/>
+            <w:shd w:fill="FFFFFF" w:val="clear"/>
+            <w:tcMar>
+              <w:top w:type="dxa" w:w="60"/>
+              <w:left w:type="dxa" w:w="120"/>
+              <w:bottom w:type="dxa" w:w="60"/>
+              <w:right w:type="dxa" w:w="120"/>
+            </w:tcMar>
+          </w:tcPr>
+          <w:p>
+            <w:pPr>
+              <w:spacing w:after="60" w:before="60"/>
+            </w:pPr>
+            <w:r>
+              <w:rPr>
+                <w:rFonts w:ascii="Arial" w:cs="Arial" w:eastAsia="Arial" w:hAnsi="Arial"/>
+                <w:color w:val="333333"/>
+              </w:rPr>
+              <w:t xml:space="preserve">Se crea en clase, en el Módulo 3</w:t>
             </w:r>
           </w:p>
         </w:tc>

</xml_diff>